<commit_message>
Add route-level API tests for auth endpoints, addressing testing feedback
</commit_message>
<xml_diff>
--- a/devlog-spiritual-corner.docx
+++ b/devlog-spiritual-corner.docx
@@ -224,15 +224,20 @@
       <w:r>
         <w:br/>
       </w:r>
+      <w:proofErr w:type="gramStart"/>
       <w:r>
         <w:rPr>
           <w:i/>
           <w:iCs/>
         </w:rPr>
-        <w:t>How:</w:t>
-      </w:r>
-      <w:r>
-        <w:t xml:space="preserve"> Searched for independent confirmation before trusting the calculated bearing.</w:t>
+        <w:t xml:space="preserve">I </w:t>
+      </w:r>
+      <w:r>
+        <w:t xml:space="preserve"> Searched</w:t>
+      </w:r>
+      <w:proofErr w:type="gramEnd"/>
+      <w:r>
+        <w:t xml:space="preserve"> for independent confirmation before trusting the calculated bearing.</w:t>
       </w:r>
       <w:r>
         <w:br/>
@@ -283,10 +288,10 @@
           <w:i/>
           <w:iCs/>
         </w:rPr>
-        <w:t>How:</w:t>
-      </w:r>
-      <w:r>
-        <w:t xml:space="preserve"> Fixed through trial and error, checking the arrow's direction against my phone's own built-in compass app until it pointed correctly — not a precisely measured calibration.</w:t>
+        <w:t xml:space="preserve">I </w:t>
+      </w:r>
+      <w:r>
+        <w:t>Fixed through trial and error, checking the arrow's direction against my phone's own built-in compass app until it pointed correctly — not a precisely measured calibration.</w:t>
       </w:r>
       <w:r>
         <w:br/>
@@ -1263,6 +1268,7 @@
   <w:style w:type="character" w:default="1" w:styleId="Policepardfaut">
     <w:name w:val="Default Paragraph Font"/>
     <w:uiPriority w:val="1"/>
+    <w:semiHidden/>
     <w:unhideWhenUsed/>
   </w:style>
   <w:style w:type="table" w:default="1" w:styleId="TableauNormal">

</xml_diff>